<commit_message>
Adiciona rf=CDI, comparação com AGM real (Augusto) e relatórios v2–v4
- src/riskfree.py: série diária do CDI (BCB/SGS) com cache; Sharpe sobre
  excesso ao CDI em vez de rf=0 (muda as conclusões: todos os Sharpes negativos
  no período, FIIs abaixo do CDI).
- src/metrics.py: estatisticas() sobre excesso; Jobson-Korkie (Memmel 2003) e
  bootstrap de bloco para diferença de Sharpe.
- src/data_load.py: baixa/cacheia CDI (data/raw/cdi.csv).
- src/centrality.py: score composto (média normalizada de grau/intermediação/
  proximidade), mesma regra de seleção dos dois braços.
- src/relatorio_utils.py: helpers de formatação do .docx.
- scripts 07–10: comparação completa, comparação com AGM do Augusto,
  robustez por subperíodos e comparação com a AGM REAL (período comum).
- docs: relatórios v2, v3 e v4 (v4 = comparação com a AGM real do Augusto).
- tabelas regeneradas em results/tables/.
</commit_message>
<xml_diff>
--- a/docs/Relatorio_Final_Yoon.docx
+++ b/docs/Relatorio_Final_Yoon.docx
@@ -110,7 +110,7 @@
         <w:jc w:val="both"/>
       </w:pPr>
       <w:r>
-        <w:t>Este projeto investiga o uso de técnicas baseadas em grafos para a formação de carteiras de Fundos de Investimento Imobiliário (FIIs), com foco no Grafo Planar Maximamente Filtrado (GPMF) e comparação com a Árvore Geradora Mínima (AGM). A partir da correlação entre os retornos, constrói-se a rede de ativos e, por métricas de centralidade, formam-se carteiras Central, Periférica e Híbrida, avaliadas quanto a risco, retorno, custos e tributos. Em relação ao relatório parcial, esta etapa (i) corrigiu a convenção de cálculo do retorno total, evitando dupla contagem de dividendos; (ii) tornou a seleção do universo determinística e reprodutível; e (iii) implementou a validação por janela deslizante (out-of-sample), núcleo científico do trabalho. Com a metodologia corrigida, as carteiras periféricas apresentam melhor relação risco-retorno tanto dentro quanto, sobretudo, fora da amostra — onde superam as centrais em todos os tamanhos testados, em linha com a hipótese de Pozzi et al. (2013). Esse resultado revisa a conclusão do relatório parcial, cuja vantagem das carteiras centrais era afetada pela dupla contagem de dividendos. Líquido de custos e tributos, porém, o benchmark passivo (IFIX) mostra-se difícil de superar e as diferenças não atingem significância estatística na janela analisada.</w:t>
+        <w:t>Este projeto investiga o uso de técnicas baseadas em grafos para a formação de carteiras de Fundos de Investimento Imobiliário (FIIs), com foco no Grafo Planar Maximamente Filtrado (GPMF) e comparação com a Árvore Geradora Mínima (AGM). A partir da correlação entre os retornos, constrói-se a rede de ativos e, por métricas de centralidade, formam-se carteiras Central, Periférica e Híbrida, avaliadas quanto a risco, retorno, custos e tributos. Em relação ao relatório parcial, esta etapa (i) corrigiu a convenção de cálculo do retorno total, evitando dupla contagem de dividendos; (ii) tornou a seleção do universo determinística e reprodutível; e (iii) implementou a validação por janela deslizante (out-of-sample), núcleo científico do trabalho. Com a metodologia corrigida — e medindo o Índice de Sharpe sobre o excesso ao CDI —, as carteiras periféricas apresentam melhor relação risco-retorno na janela completa fora da amostra, superando as centrais em todos os tamanhos testados, em linha com a hipótese de Pozzi et al. (2013). Esse resultado revisa a conclusão do relatório parcial, cuja vantagem das carteiras centrais era afetada pela dupla contagem de dividendos. A vantagem da periferia é, porém, qualificada por três limites: líquido de custos e tributos nenhuma carteira ativa supera o benchmark passivo (IFIX); a diferença periferia−centro não atinge significância estatística (intervalo de confiança por bootstrap cruza zero); e ela não é estável no tempo, concentrando-se no sub-período de mercado fraco e invertendo-se na recuperação — sugerindo um caráter defensivo, dependente de regime.</w:t>
       </w:r>
     </w:p>
     <w:p>
@@ -294,7 +294,7 @@
         <w:jc w:val="both"/>
       </w:pPr>
       <w:r>
-        <w:t>Aplica-se custo de transação de 0,3% sobre o giro a cada rebalanceamento e imposto de 15% sobre o ganho de capital realizado em cada janela; os dividendos de FII são isentos para pessoa física. A significância das diferenças de Índice de Sharpe é avaliada pelo teste de Jobson-Korkie com correção de Memmel (2003). O mesmo arcabouço é aplicado à AGM para a comparação direta GPMF × AGM.</w:t>
+        <w:t>Aplica-se custo de transação de 0,3% sobre o giro a cada rebalanceamento e imposto de 15% sobre o ganho de capital realizado em cada janela; os dividendos de FII são isentos para pessoa física. O Índice de Sharpe é calculado sobre o retorno EXCEDENTE em relação ao CDI diário (série 12 do SGS/BCB; média de 12.0% a.a. no período) — e não sobre retorno bruto: para ativo brasileiro com a Selic em dois dígitos, adotar taxa livre de risco nula infla artificialmente o Sharpe e é a correção que mais altera os números em relação a versões anteriores. A significância das diferenças de Índice de Sharpe é avaliada de duas formas complementares: o teste assintótico de Jobson-Korkie com correção de Memmel (2003) e um intervalo de confiança de 95% por bootstrap de blocos circulares (que respeita a autocorrelação diária). O mesmo arcabouço é aplicado à AGM para a comparação GPMF × AGM.</w:t>
       </w:r>
     </w:p>
     <w:p>
@@ -460,7 +460,7 @@
           </w:tcPr>
           <w:p>
             <w:r>
-              <w:t>1.159</w:t>
+              <w:t>-0.433</w:t>
             </w:r>
           </w:p>
         </w:tc>
@@ -532,7 +532,7 @@
           </w:tcPr>
           <w:p>
             <w:r>
-              <w:t>1.369</w:t>
+              <w:t>-0.283</w:t>
             </w:r>
           </w:p>
         </w:tc>
@@ -604,7 +604,7 @@
           </w:tcPr>
           <w:p>
             <w:r>
-              <w:t>1.520</w:t>
+              <w:t>-0.251</w:t>
             </w:r>
           </w:p>
         </w:tc>
@@ -676,7 +676,7 @@
           </w:tcPr>
           <w:p>
             <w:r>
-              <w:t>1.397</w:t>
+              <w:t>-0.252</w:t>
             </w:r>
           </w:p>
         </w:tc>
@@ -748,7 +748,7 @@
           </w:tcPr>
           <w:p>
             <w:r>
-              <w:t>0.733</w:t>
+              <w:t>-0.851</w:t>
             </w:r>
           </w:p>
         </w:tc>
@@ -820,7 +820,7 @@
           </w:tcPr>
           <w:p>
             <w:r>
-              <w:t>0.864</w:t>
+              <w:t>-0.888</w:t>
             </w:r>
           </w:p>
         </w:tc>
@@ -892,7 +892,7 @@
           </w:tcPr>
           <w:p>
             <w:r>
-              <w:t>1.266</w:t>
+              <w:t>-0.249</w:t>
             </w:r>
           </w:p>
         </w:tc>
@@ -964,7 +964,7 @@
           </w:tcPr>
           <w:p>
             <w:r>
-              <w:t>1.352</w:t>
+              <w:t>-0.263</w:t>
             </w:r>
           </w:p>
         </w:tc>
@@ -1036,7 +1036,7 @@
           </w:tcPr>
           <w:p>
             <w:r>
-              <w:t>1.400</w:t>
+              <w:t>-0.378</w:t>
             </w:r>
           </w:p>
         </w:tc>
@@ -1108,7 +1108,7 @@
           </w:tcPr>
           <w:p>
             <w:r>
-              <w:t>0.911</w:t>
+              <w:t>-0.489</w:t>
             </w:r>
           </w:p>
         </w:tc>
@@ -1212,7 +1212,7 @@
         <w:jc w:val="both"/>
       </w:pPr>
       <w:r>
-        <w:t>A Tabela 2 traz o desempenho bruto (sem custos) fora da amostra. As carteiras periféricas superam as centrais em todos os tamanhos testados (10, 15 e 20), sustentando de forma consistente a hipótese de Pozzi sem o viés de antecipação. O GPMF manteve-se planar e conexo, com 147 arestas, em todos os 25 rebalanceamentos.</w:t>
+        <w:t>A Tabela 2 traz o desempenho bruto (sem custos) fora da amostra. Na janela completa as carteiras periféricas superam as centrais em todos os tamanhos testados (10, 15 e 20), favorecendo a hipótese de Pozzi sem o viés de antecipação — ressalvando-se que essa vantagem não é estatisticamente significativa nem estável ao longo do ciclo, como mostram as seções de significância e de robustez por sub-período. O GPMF manteve-se planar e conexo, com 147 arestas, em todos os 25 rebalanceamentos.</w:t>
       </w:r>
     </w:p>
     <w:p>
@@ -1348,7 +1348,7 @@
           </w:tcPr>
           <w:p>
             <w:r>
-              <w:t>0.033</w:t>
+              <w:t>-1.398</w:t>
             </w:r>
           </w:p>
         </w:tc>
@@ -1420,7 +1420,7 @@
           </w:tcPr>
           <w:p>
             <w:r>
-              <w:t>0.223</w:t>
+              <w:t>-1.290</w:t>
             </w:r>
           </w:p>
         </w:tc>
@@ -1492,7 +1492,7 @@
           </w:tcPr>
           <w:p>
             <w:r>
-              <w:t>0.236</w:t>
+              <w:t>-1.285</w:t>
             </w:r>
           </w:p>
         </w:tc>
@@ -1564,7 +1564,7 @@
           </w:tcPr>
           <w:p>
             <w:r>
-              <w:t>0.472</w:t>
+              <w:t>-0.878</w:t>
             </w:r>
           </w:p>
         </w:tc>
@@ -1636,7 +1636,7 @@
           </w:tcPr>
           <w:p>
             <w:r>
-              <w:t>0.524</w:t>
+              <w:t>-0.984</w:t>
             </w:r>
           </w:p>
         </w:tc>
@@ -1708,7 +1708,7 @@
           </w:tcPr>
           <w:p>
             <w:r>
-              <w:t>0.665</w:t>
+              <w:t>-0.963</w:t>
             </w:r>
           </w:p>
         </w:tc>
@@ -1780,7 +1780,7 @@
           </w:tcPr>
           <w:p>
             <w:r>
-              <w:t>0.287</w:t>
+              <w:t>-1.193</w:t>
             </w:r>
           </w:p>
         </w:tc>
@@ -1852,7 +1852,7 @@
           </w:tcPr>
           <w:p>
             <w:r>
-              <w:t>0.468</w:t>
+              <w:t>-1.066</w:t>
             </w:r>
           </w:p>
         </w:tc>
@@ -1924,7 +1924,7 @@
           </w:tcPr>
           <w:p>
             <w:r>
-              <w:t>0.286</w:t>
+              <w:t>-1.248</w:t>
             </w:r>
           </w:p>
         </w:tc>
@@ -1996,7 +1996,7 @@
           </w:tcPr>
           <w:p>
             <w:r>
-              <w:t>0.690</w:t>
+              <w:t>-0.907</w:t>
             </w:r>
           </w:p>
         </w:tc>
@@ -2226,7 +2226,7 @@
           </w:tcPr>
           <w:p>
             <w:r>
-              <w:t>0.033</w:t>
+              <w:t>-1.398</w:t>
             </w:r>
           </w:p>
         </w:tc>
@@ -2246,7 +2246,7 @@
           </w:tcPr>
           <w:p>
             <w:r>
-              <w:t>-0.300</w:t>
+              <w:t>-1.720</w:t>
             </w:r>
           </w:p>
         </w:tc>
@@ -2298,7 +2298,7 @@
           </w:tcPr>
           <w:p>
             <w:r>
-              <w:t>0.223</w:t>
+              <w:t>-1.290</w:t>
             </w:r>
           </w:p>
         </w:tc>
@@ -2318,7 +2318,7 @@
           </w:tcPr>
           <w:p>
             <w:r>
-              <w:t>-0.130</w:t>
+              <w:t>-1.628</w:t>
             </w:r>
           </w:p>
         </w:tc>
@@ -2370,7 +2370,7 @@
           </w:tcPr>
           <w:p>
             <w:r>
-              <w:t>0.236</w:t>
+              <w:t>-1.285</w:t>
             </w:r>
           </w:p>
         </w:tc>
@@ -2390,7 +2390,7 @@
           </w:tcPr>
           <w:p>
             <w:r>
-              <w:t>-0.114</w:t>
+              <w:t>-1.620</w:t>
             </w:r>
           </w:p>
         </w:tc>
@@ -2442,7 +2442,7 @@
           </w:tcPr>
           <w:p>
             <w:r>
-              <w:t>0.472</w:t>
+              <w:t>-0.878</w:t>
             </w:r>
           </w:p>
         </w:tc>
@@ -2462,7 +2462,7 @@
           </w:tcPr>
           <w:p>
             <w:r>
-              <w:t>0.007</w:t>
+              <w:t>-1.340</w:t>
             </w:r>
           </w:p>
         </w:tc>
@@ -2514,7 +2514,7 @@
           </w:tcPr>
           <w:p>
             <w:r>
-              <w:t>0.524</w:t>
+              <w:t>-0.984</w:t>
             </w:r>
           </w:p>
         </w:tc>
@@ -2534,7 +2534,7 @@
           </w:tcPr>
           <w:p>
             <w:r>
-              <w:t>0.079</w:t>
+              <w:t>-1.421</w:t>
             </w:r>
           </w:p>
         </w:tc>
@@ -2586,7 +2586,7 @@
           </w:tcPr>
           <w:p>
             <w:r>
-              <w:t>0.665</w:t>
+              <w:t>-0.963</w:t>
             </w:r>
           </w:p>
         </w:tc>
@@ -2606,7 +2606,7 @@
           </w:tcPr>
           <w:p>
             <w:r>
-              <w:t>0.222</w:t>
+              <w:t>-1.397</w:t>
             </w:r>
           </w:p>
         </w:tc>
@@ -2658,7 +2658,7 @@
           </w:tcPr>
           <w:p>
             <w:r>
-              <w:t>0.287</w:t>
+              <w:t>-1.193</w:t>
             </w:r>
           </w:p>
         </w:tc>
@@ -2678,7 +2678,7 @@
           </w:tcPr>
           <w:p>
             <w:r>
-              <w:t>-0.165</w:t>
+              <w:t>-1.642</w:t>
             </w:r>
           </w:p>
         </w:tc>
@@ -2730,7 +2730,7 @@
           </w:tcPr>
           <w:p>
             <w:r>
-              <w:t>0.468</w:t>
+              <w:t>-1.066</w:t>
             </w:r>
           </w:p>
         </w:tc>
@@ -2750,7 +2750,7 @@
           </w:tcPr>
           <w:p>
             <w:r>
-              <w:t>0.008</w:t>
+              <w:t>-1.517</w:t>
             </w:r>
           </w:p>
         </w:tc>
@@ -2802,7 +2802,7 @@
           </w:tcPr>
           <w:p>
             <w:r>
-              <w:t>0.286</w:t>
+              <w:t>-1.248</w:t>
             </w:r>
           </w:p>
         </w:tc>
@@ -2822,7 +2822,7 @@
           </w:tcPr>
           <w:p>
             <w:r>
-              <w:t>-0.144</w:t>
+              <w:t>-1.668</w:t>
             </w:r>
           </w:p>
         </w:tc>
@@ -2902,6 +2902,760 @@
     </w:p>
     <w:p>
       <w:pPr>
+        <w:jc w:val="both"/>
+      </w:pPr>
+      <w:r>
+        <w:t>A Tabela 4 isola as duas parcelas do arrasto entre bruto e líquido. O custo de transação acompanha o giro — as carteiras periféricas e híbridas, de maior rotatividade, pagam mais —, mas é o imposto sobre o ganho de capital o componente dominante. Em conjunto, custo e imposto consomem todo o prêmio bruto das carteiras de centro e híbridas, que terminam com retorno líquido negativo; apenas as periféricas maiores (15 e 20) preservam retorno líquido positivo.</w:t>
+      </w:r>
+    </w:p>
+    <w:p>
+      <w:r>
+        <w:rPr>
+          <w:b/>
+          <w:color w:val="1F3B73"/>
+        </w:rPr>
+        <w:t>Tabela 4 — Decomposição do arrasto: custo de transação × imposto</w:t>
+      </w:r>
+    </w:p>
+    <w:tbl>
+      <w:tblPr>
+        <w:tblStyle w:val="LightGrid-Accent1"/>
+        <w:tblW w:type="auto" w:w="0"/>
+        <w:tblLook w:firstColumn="1" w:firstRow="1" w:lastColumn="0" w:lastRow="0" w:noHBand="0" w:noVBand="1" w:val="04A0"/>
+      </w:tblPr>
+      <w:tblGrid>
+        <w:gridCol w:w="1234"/>
+        <w:gridCol w:w="1234"/>
+        <w:gridCol w:w="1234"/>
+        <w:gridCol w:w="1234"/>
+        <w:gridCol w:w="1234"/>
+        <w:gridCol w:w="1234"/>
+        <w:gridCol w:w="1234"/>
+      </w:tblGrid>
+      <w:tr>
+        <w:tc>
+          <w:tcPr>
+            <w:tcW w:type="dxa" w:w="1234"/>
+          </w:tcPr>
+          <w:p>
+            <w:r>
+              <w:t>carteira</w:t>
+            </w:r>
+          </w:p>
+        </w:tc>
+        <w:tc>
+          <w:tcPr>
+            <w:tcW w:type="dxa" w:w="1234"/>
+          </w:tcPr>
+          <w:p>
+            <w:r>
+              <w:t>giro_medio_am</w:t>
+            </w:r>
+          </w:p>
+        </w:tc>
+        <w:tc>
+          <w:tcPr>
+            <w:tcW w:type="dxa" w:w="1234"/>
+          </w:tcPr>
+          <w:p>
+            <w:r>
+              <w:t>custo_medio_am</w:t>
+            </w:r>
+          </w:p>
+        </w:tc>
+        <w:tc>
+          <w:tcPr>
+            <w:tcW w:type="dxa" w:w="1234"/>
+          </w:tcPr>
+          <w:p>
+            <w:r>
+              <w:t>ret_bruto_aa</w:t>
+            </w:r>
+          </w:p>
+        </w:tc>
+        <w:tc>
+          <w:tcPr>
+            <w:tcW w:type="dxa" w:w="1234"/>
+          </w:tcPr>
+          <w:p>
+            <w:r>
+              <w:t>arrasto_custo_aa</w:t>
+            </w:r>
+          </w:p>
+        </w:tc>
+        <w:tc>
+          <w:tcPr>
+            <w:tcW w:type="dxa" w:w="1234"/>
+          </w:tcPr>
+          <w:p>
+            <w:r>
+              <w:t>arrasto_imposto_aa</w:t>
+            </w:r>
+          </w:p>
+        </w:tc>
+        <w:tc>
+          <w:tcPr>
+            <w:tcW w:type="dxa" w:w="1234"/>
+          </w:tcPr>
+          <w:p>
+            <w:r>
+              <w:t>ret_liq_aa</w:t>
+            </w:r>
+          </w:p>
+        </w:tc>
+      </w:tr>
+      <w:tr>
+        <w:tc>
+          <w:tcPr>
+            <w:tcW w:type="dxa" w:w="1234"/>
+          </w:tcPr>
+          <w:p>
+            <w:r>
+              <w:t>central_10</w:t>
+            </w:r>
+          </w:p>
+        </w:tc>
+        <w:tc>
+          <w:tcPr>
+            <w:tcW w:type="dxa" w:w="1234"/>
+          </w:tcPr>
+          <w:p>
+            <w:r>
+              <w:t>28.80%</w:t>
+            </w:r>
+          </w:p>
+        </w:tc>
+        <w:tc>
+          <w:tcPr>
+            <w:tcW w:type="dxa" w:w="1234"/>
+          </w:tcPr>
+          <w:p>
+            <w:r>
+              <w:t>0.09%</w:t>
+            </w:r>
+          </w:p>
+        </w:tc>
+        <w:tc>
+          <w:tcPr>
+            <w:tcW w:type="dxa" w:w="1234"/>
+          </w:tcPr>
+          <w:p>
+            <w:r>
+              <w:t>-0.06%</w:t>
+            </w:r>
+          </w:p>
+        </w:tc>
+        <w:tc>
+          <w:tcPr>
+            <w:tcW w:type="dxa" w:w="1234"/>
+          </w:tcPr>
+          <w:p>
+            <w:r>
+              <w:t>0.99%</w:t>
+            </w:r>
+          </w:p>
+        </w:tc>
+        <w:tc>
+          <w:tcPr>
+            <w:tcW w:type="dxa" w:w="1234"/>
+          </w:tcPr>
+          <w:p>
+            <w:r>
+              <w:t>1.71%</w:t>
+            </w:r>
+          </w:p>
+        </w:tc>
+        <w:tc>
+          <w:tcPr>
+            <w:tcW w:type="dxa" w:w="1234"/>
+          </w:tcPr>
+          <w:p>
+            <w:r>
+              <w:t>-2.76%</w:t>
+            </w:r>
+          </w:p>
+        </w:tc>
+      </w:tr>
+      <w:tr>
+        <w:tc>
+          <w:tcPr>
+            <w:tcW w:type="dxa" w:w="1234"/>
+          </w:tcPr>
+          <w:p>
+            <w:r>
+              <w:t>central_15</w:t>
+            </w:r>
+          </w:p>
+        </w:tc>
+        <w:tc>
+          <w:tcPr>
+            <w:tcW w:type="dxa" w:w="1234"/>
+          </w:tcPr>
+          <w:p>
+            <w:r>
+              <w:t>26.27%</w:t>
+            </w:r>
+          </w:p>
+        </w:tc>
+        <w:tc>
+          <w:tcPr>
+            <w:tcW w:type="dxa" w:w="1234"/>
+          </w:tcPr>
+          <w:p>
+            <w:r>
+              <w:t>0.08%</w:t>
+            </w:r>
+          </w:p>
+        </w:tc>
+        <w:tc>
+          <w:tcPr>
+            <w:tcW w:type="dxa" w:w="1234"/>
+          </w:tcPr>
+          <w:p>
+            <w:r>
+              <w:t>1.44%</w:t>
+            </w:r>
+          </w:p>
+        </w:tc>
+        <w:tc>
+          <w:tcPr>
+            <w:tcW w:type="dxa" w:w="1234"/>
+          </w:tcPr>
+          <w:p>
+            <w:r>
+              <w:t>0.91%</w:t>
+            </w:r>
+          </w:p>
+        </w:tc>
+        <w:tc>
+          <w:tcPr>
+            <w:tcW w:type="dxa" w:w="1234"/>
+          </w:tcPr>
+          <w:p>
+            <w:r>
+              <w:t>1.83%</w:t>
+            </w:r>
+          </w:p>
+        </w:tc>
+        <w:tc>
+          <w:tcPr>
+            <w:tcW w:type="dxa" w:w="1234"/>
+          </w:tcPr>
+          <w:p>
+            <w:r>
+              <w:t>-1.30%</w:t>
+            </w:r>
+          </w:p>
+        </w:tc>
+      </w:tr>
+      <w:tr>
+        <w:tc>
+          <w:tcPr>
+            <w:tcW w:type="dxa" w:w="1234"/>
+          </w:tcPr>
+          <w:p>
+            <w:r>
+              <w:t>central_20</w:t>
+            </w:r>
+          </w:p>
+        </w:tc>
+        <w:tc>
+          <w:tcPr>
+            <w:tcW w:type="dxa" w:w="1234"/>
+          </w:tcPr>
+          <w:p>
+            <w:r>
+              <w:t>27.60%</w:t>
+            </w:r>
+          </w:p>
+        </w:tc>
+        <w:tc>
+          <w:tcPr>
+            <w:tcW w:type="dxa" w:w="1234"/>
+          </w:tcPr>
+          <w:p>
+            <w:r>
+              <w:t>0.08%</w:t>
+            </w:r>
+          </w:p>
+        </w:tc>
+        <w:tc>
+          <w:tcPr>
+            <w:tcW w:type="dxa" w:w="1234"/>
+          </w:tcPr>
+          <w:p>
+            <w:r>
+              <w:t>1.53%</w:t>
+            </w:r>
+          </w:p>
+        </w:tc>
+        <w:tc>
+          <w:tcPr>
+            <w:tcW w:type="dxa" w:w="1234"/>
+          </w:tcPr>
+          <w:p>
+            <w:r>
+              <w:t>0.96%</w:t>
+            </w:r>
+          </w:p>
+        </w:tc>
+        <w:tc>
+          <w:tcPr>
+            <w:tcW w:type="dxa" w:w="1234"/>
+          </w:tcPr>
+          <w:p>
+            <w:r>
+              <w:t>1.74%</w:t>
+            </w:r>
+          </w:p>
+        </w:tc>
+        <w:tc>
+          <w:tcPr>
+            <w:tcW w:type="dxa" w:w="1234"/>
+          </w:tcPr>
+          <w:p>
+            <w:r>
+              <w:t>-1.17%</w:t>
+            </w:r>
+          </w:p>
+        </w:tc>
+      </w:tr>
+      <w:tr>
+        <w:tc>
+          <w:tcPr>
+            <w:tcW w:type="dxa" w:w="1234"/>
+          </w:tcPr>
+          <w:p>
+            <w:r>
+              <w:t>peripheral_10</w:t>
+            </w:r>
+          </w:p>
+        </w:tc>
+        <w:tc>
+          <w:tcPr>
+            <w:tcW w:type="dxa" w:w="1234"/>
+          </w:tcPr>
+          <w:p>
+            <w:r>
+              <w:t>55.60%</w:t>
+            </w:r>
+          </w:p>
+        </w:tc>
+        <w:tc>
+          <w:tcPr>
+            <w:tcW w:type="dxa" w:w="1234"/>
+          </w:tcPr>
+          <w:p>
+            <w:r>
+              <w:t>0.17%</w:t>
+            </w:r>
+          </w:p>
+        </w:tc>
+        <w:tc>
+          <w:tcPr>
+            <w:tcW w:type="dxa" w:w="1234"/>
+          </w:tcPr>
+          <w:p>
+            <w:r>
+              <w:t>3.77%</w:t>
+            </w:r>
+          </w:p>
+        </w:tc>
+        <w:tc>
+          <w:tcPr>
+            <w:tcW w:type="dxa" w:w="1234"/>
+          </w:tcPr>
+          <w:p>
+            <w:r>
+              <w:t>1.97%</w:t>
+            </w:r>
+          </w:p>
+        </w:tc>
+        <w:tc>
+          <w:tcPr>
+            <w:tcW w:type="dxa" w:w="1234"/>
+          </w:tcPr>
+          <w:p>
+            <w:r>
+              <w:t>2.12%</w:t>
+            </w:r>
+          </w:p>
+        </w:tc>
+        <w:tc>
+          <w:tcPr>
+            <w:tcW w:type="dxa" w:w="1234"/>
+          </w:tcPr>
+          <w:p>
+            <w:r>
+              <w:t>-0.31%</w:t>
+            </w:r>
+          </w:p>
+        </w:tc>
+      </w:tr>
+      <w:tr>
+        <w:tc>
+          <w:tcPr>
+            <w:tcW w:type="dxa" w:w="1234"/>
+          </w:tcPr>
+          <w:p>
+            <w:r>
+              <w:t>peripheral_15</w:t>
+            </w:r>
+          </w:p>
+        </w:tc>
+        <w:tc>
+          <w:tcPr>
+            <w:tcW w:type="dxa" w:w="1234"/>
+          </w:tcPr>
+          <w:p>
+            <w:r>
+              <w:t>42.27%</w:t>
+            </w:r>
+          </w:p>
+        </w:tc>
+        <w:tc>
+          <w:tcPr>
+            <w:tcW w:type="dxa" w:w="1234"/>
+          </w:tcPr>
+          <w:p>
+            <w:r>
+              <w:t>0.13%</w:t>
+            </w:r>
+          </w:p>
+        </w:tc>
+        <w:tc>
+          <w:tcPr>
+            <w:tcW w:type="dxa" w:w="1234"/>
+          </w:tcPr>
+          <w:p>
+            <w:r>
+              <w:t>3.82%</w:t>
+            </w:r>
+          </w:p>
+        </w:tc>
+        <w:tc>
+          <w:tcPr>
+            <w:tcW w:type="dxa" w:w="1234"/>
+          </w:tcPr>
+          <w:p>
+            <w:r>
+              <w:t>1.50%</w:t>
+            </w:r>
+          </w:p>
+        </w:tc>
+        <w:tc>
+          <w:tcPr>
+            <w:tcW w:type="dxa" w:w="1234"/>
+          </w:tcPr>
+          <w:p>
+            <w:r>
+              <w:t>2.01%</w:t>
+            </w:r>
+          </w:p>
+        </w:tc>
+        <w:tc>
+          <w:tcPr>
+            <w:tcW w:type="dxa" w:w="1234"/>
+          </w:tcPr>
+          <w:p>
+            <w:r>
+              <w:t>0.31%</w:t>
+            </w:r>
+          </w:p>
+        </w:tc>
+      </w:tr>
+      <w:tr>
+        <w:tc>
+          <w:tcPr>
+            <w:tcW w:type="dxa" w:w="1234"/>
+          </w:tcPr>
+          <w:p>
+            <w:r>
+              <w:t>peripheral_20</w:t>
+            </w:r>
+          </w:p>
+        </w:tc>
+        <w:tc>
+          <w:tcPr>
+            <w:tcW w:type="dxa" w:w="1234"/>
+          </w:tcPr>
+          <w:p>
+            <w:r>
+              <w:t>32.80%</w:t>
+            </w:r>
+          </w:p>
+        </w:tc>
+        <w:tc>
+          <w:tcPr>
+            <w:tcW w:type="dxa" w:w="1234"/>
+          </w:tcPr>
+          <w:p>
+            <w:r>
+              <w:t>0.10%</w:t>
+            </w:r>
+          </w:p>
+        </w:tc>
+        <w:tc>
+          <w:tcPr>
+            <w:tcW w:type="dxa" w:w="1234"/>
+          </w:tcPr>
+          <w:p>
+            <w:r>
+              <w:t>4.61%</w:t>
+            </w:r>
+          </w:p>
+        </w:tc>
+        <w:tc>
+          <w:tcPr>
+            <w:tcW w:type="dxa" w:w="1234"/>
+          </w:tcPr>
+          <w:p>
+            <w:r>
+              <w:t>1.17%</w:t>
+            </w:r>
+          </w:p>
+        </w:tc>
+        <w:tc>
+          <w:tcPr>
+            <w:tcW w:type="dxa" w:w="1234"/>
+          </w:tcPr>
+          <w:p>
+            <w:r>
+              <w:t>2.09%</w:t>
+            </w:r>
+          </w:p>
+        </w:tc>
+        <w:tc>
+          <w:tcPr>
+            <w:tcW w:type="dxa" w:w="1234"/>
+          </w:tcPr>
+          <w:p>
+            <w:r>
+              <w:t>1.35%</w:t>
+            </w:r>
+          </w:p>
+        </w:tc>
+      </w:tr>
+      <w:tr>
+        <w:tc>
+          <w:tcPr>
+            <w:tcW w:type="dxa" w:w="1234"/>
+          </w:tcPr>
+          <w:p>
+            <w:r>
+              <w:t>hybrid_10</w:t>
+            </w:r>
+          </w:p>
+        </w:tc>
+        <w:tc>
+          <w:tcPr>
+            <w:tcW w:type="dxa" w:w="1234"/>
+          </w:tcPr>
+          <w:p>
+            <w:r>
+              <w:t>49.20%</w:t>
+            </w:r>
+          </w:p>
+        </w:tc>
+        <w:tc>
+          <w:tcPr>
+            <w:tcW w:type="dxa" w:w="1234"/>
+          </w:tcPr>
+          <w:p>
+            <w:r>
+              <w:t>0.15%</w:t>
+            </w:r>
+          </w:p>
+        </w:tc>
+        <w:tc>
+          <w:tcPr>
+            <w:tcW w:type="dxa" w:w="1234"/>
+          </w:tcPr>
+          <w:p>
+            <w:r>
+              <w:t>1.97%</w:t>
+            </w:r>
+          </w:p>
+        </w:tc>
+        <w:tc>
+          <w:tcPr>
+            <w:tcW w:type="dxa" w:w="1234"/>
+          </w:tcPr>
+          <w:p>
+            <w:r>
+              <w:t>1.71%</w:t>
+            </w:r>
+          </w:p>
+        </w:tc>
+        <w:tc>
+          <w:tcPr>
+            <w:tcW w:type="dxa" w:w="1234"/>
+          </w:tcPr>
+          <w:p>
+            <w:r>
+              <w:t>1.87%</w:t>
+            </w:r>
+          </w:p>
+        </w:tc>
+        <w:tc>
+          <w:tcPr>
+            <w:tcW w:type="dxa" w:w="1234"/>
+          </w:tcPr>
+          <w:p>
+            <w:r>
+              <w:t>-1.60%</w:t>
+            </w:r>
+          </w:p>
+        </w:tc>
+      </w:tr>
+      <w:tr>
+        <w:tc>
+          <w:tcPr>
+            <w:tcW w:type="dxa" w:w="1234"/>
+          </w:tcPr>
+          <w:p>
+            <w:r>
+              <w:t>hybrid_15</w:t>
+            </w:r>
+          </w:p>
+        </w:tc>
+        <w:tc>
+          <w:tcPr>
+            <w:tcW w:type="dxa" w:w="1234"/>
+          </w:tcPr>
+          <w:p>
+            <w:r>
+              <w:t>44.93%</w:t>
+            </w:r>
+          </w:p>
+        </w:tc>
+        <w:tc>
+          <w:tcPr>
+            <w:tcW w:type="dxa" w:w="1234"/>
+          </w:tcPr>
+          <w:p>
+            <w:r>
+              <w:t>0.13%</w:t>
+            </w:r>
+          </w:p>
+        </w:tc>
+        <w:tc>
+          <w:tcPr>
+            <w:tcW w:type="dxa" w:w="1234"/>
+          </w:tcPr>
+          <w:p>
+            <w:r>
+              <w:t>3.32%</w:t>
+            </w:r>
+          </w:p>
+        </w:tc>
+        <w:tc>
+          <w:tcPr>
+            <w:tcW w:type="dxa" w:w="1234"/>
+          </w:tcPr>
+          <w:p>
+            <w:r>
+              <w:t>1.58%</w:t>
+            </w:r>
+          </w:p>
+        </w:tc>
+        <w:tc>
+          <w:tcPr>
+            <w:tcW w:type="dxa" w:w="1234"/>
+          </w:tcPr>
+          <w:p>
+            <w:r>
+              <w:t>1.97%</w:t>
+            </w:r>
+          </w:p>
+        </w:tc>
+        <w:tc>
+          <w:tcPr>
+            <w:tcW w:type="dxa" w:w="1234"/>
+          </w:tcPr>
+          <w:p>
+            <w:r>
+              <w:t>-0.23%</w:t>
+            </w:r>
+          </w:p>
+        </w:tc>
+      </w:tr>
+      <w:tr>
+        <w:tc>
+          <w:tcPr>
+            <w:tcW w:type="dxa" w:w="1234"/>
+          </w:tcPr>
+          <w:p>
+            <w:r>
+              <w:t>hybrid_20</w:t>
+            </w:r>
+          </w:p>
+        </w:tc>
+        <w:tc>
+          <w:tcPr>
+            <w:tcW w:type="dxa" w:w="1234"/>
+          </w:tcPr>
+          <w:p>
+            <w:r>
+              <w:t>40.80%</w:t>
+            </w:r>
+          </w:p>
+        </w:tc>
+        <w:tc>
+          <w:tcPr>
+            <w:tcW w:type="dxa" w:w="1234"/>
+          </w:tcPr>
+          <w:p>
+            <w:r>
+              <w:t>0.12%</w:t>
+            </w:r>
+          </w:p>
+        </w:tc>
+        <w:tc>
+          <w:tcPr>
+            <w:tcW w:type="dxa" w:w="1234"/>
+          </w:tcPr>
+          <w:p>
+            <w:r>
+              <w:t>1.90%</w:t>
+            </w:r>
+          </w:p>
+        </w:tc>
+        <w:tc>
+          <w:tcPr>
+            <w:tcW w:type="dxa" w:w="1234"/>
+          </w:tcPr>
+          <w:p>
+            <w:r>
+              <w:t>1.42%</w:t>
+            </w:r>
+          </w:p>
+        </w:tc>
+        <w:tc>
+          <w:tcPr>
+            <w:tcW w:type="dxa" w:w="1234"/>
+          </w:tcPr>
+          <w:p>
+            <w:r>
+              <w:t>1.86%</w:t>
+            </w:r>
+          </w:p>
+        </w:tc>
+        <w:tc>
+          <w:tcPr>
+            <w:tcW w:type="dxa" w:w="1234"/>
+          </w:tcPr>
+          <w:p>
+            <w:r>
+              <w:t>-1.38%</w:t>
+            </w:r>
+          </w:p>
+        </w:tc>
+      </w:tr>
+    </w:tbl>
+    <w:p/>
+    <w:p>
+      <w:pPr>
         <w:pStyle w:val="Heading2"/>
       </w:pPr>
       <w:r>
@@ -2916,7 +3670,7 @@
         <w:jc w:val="both"/>
       </w:pPr>
       <w:r>
-        <w:t>A Tabela 4 traz o teste de Jobson-Korkie sobre as séries líquidas. As diferenças de Sharpe observadas não atingem significância a 5% na janela disponível — resultado coerente com o poder estatístico limitado de uma série fora da amostra ainda relativamente curta.</w:t>
+        <w:t>A Tabela 5 resume, para cada par de séries líquidas, a diferença de Índice de Sharpe anualizado, o intervalo de confiança de 95% por bootstrap de blocos e o p-valor do teste de Jobson-Korkie. Entre as próprias carteiras GPMF, a diferença periferia−centro é positiva mas o intervalo de confiança cruza zero: a vantagem da periferia não atinge significância estatística na janela disponível por nenhum dos dois critérios. Frente ao benchmark surge uma distinção sugestiva, porém dependente do método: pelo bootstrap, a Central-10 e a Híbrida-10 ficam abaixo do IFIX com intervalo inteiramente negativo (p_boot ≈ 0,01), enquanto a Periférica-10 inclui zero — mas o teste assintótico de Jobson-Korkie, mais conservador, NÃO rejeita a igualdade em nenhum dos casos (p_JK ≈ 0,11–0,17). A leitura prudente é que a periferia, no máximo, empata com o índice passivo, e há indício (não conclusivo) de que o centro fique atrás dele; confirmar isso exige uma janela fora da amostra mais longa.</w:t>
       </w:r>
     </w:p>
     <w:p>
@@ -2925,7 +3679,7 @@
           <w:b/>
           <w:color w:val="1F3B73"/>
         </w:rPr>
-        <w:t>Tabela 4 — Teste de Jobson-Korkie (diferença de Índice de Sharpe, líquido)</w:t>
+        <w:t>Tabela 5 — Diferença de Índice de Sharpe (líquido): IC95 por bootstrap e p-valores</w:t>
       </w:r>
     </w:p>
     <w:tbl>
@@ -2949,7 +3703,7 @@
           </w:tcPr>
           <w:p>
             <w:r>
-              <w:t>carteira A</w:t>
+              <w:t>comparação</w:t>
             </w:r>
           </w:p>
         </w:tc>
@@ -2959,7 +3713,7 @@
           </w:tcPr>
           <w:p>
             <w:r>
-              <w:t>carteira B</w:t>
+              <w:t>ΔSharpe (aa)</w:t>
             </w:r>
           </w:p>
         </w:tc>
@@ -2969,7 +3723,7 @@
           </w:tcPr>
           <w:p>
             <w:r>
-              <w:t>ΔSharpe</w:t>
+              <w:t>IC95 (aa)</w:t>
             </w:r>
           </w:p>
         </w:tc>
@@ -2979,7 +3733,7 @@
           </w:tcPr>
           <w:p>
             <w:r>
-              <w:t>z</w:t>
+              <w:t>p (boot)</w:t>
             </w:r>
           </w:p>
         </w:tc>
@@ -2989,7 +3743,7 @@
           </w:tcPr>
           <w:p>
             <w:r>
-              <w:t>p</w:t>
+              <w:t>p (JK)</w:t>
             </w:r>
           </w:p>
         </w:tc>
@@ -3011,7 +3765,7 @@
           </w:tcPr>
           <w:p>
             <w:r>
-              <w:t>peripheral_10</w:t>
+              <w:t>peripheral_10 vs central_10</w:t>
             </w:r>
           </w:p>
         </w:tc>
@@ -3021,7 +3775,7 @@
           </w:tcPr>
           <w:p>
             <w:r>
-              <w:t>central_10</w:t>
+              <w:t>+0.38</w:t>
             </w:r>
           </w:p>
         </w:tc>
@@ -3031,7 +3785,7 @@
           </w:tcPr>
           <w:p>
             <w:r>
-              <w:t>0.019</w:t>
+              <w:t>[-0.42; +1.43]</w:t>
             </w:r>
           </w:p>
         </w:tc>
@@ -3041,7 +3795,7 @@
           </w:tcPr>
           <w:p>
             <w:r>
-              <w:t>0.540</w:t>
+              <w:t>+0.36</w:t>
             </w:r>
           </w:p>
         </w:tc>
@@ -3051,7 +3805,7 @@
           </w:tcPr>
           <w:p>
             <w:r>
-              <w:t>0.589</w:t>
+              <w:t>+0.51</w:t>
             </w:r>
           </w:p>
         </w:tc>
@@ -3073,7 +3827,7 @@
           </w:tcPr>
           <w:p>
             <w:r>
-              <w:t>hybrid_10</w:t>
+              <w:t>hybrid_10 vs central_10</w:t>
             </w:r>
           </w:p>
         </w:tc>
@@ -3083,7 +3837,7 @@
           </w:tcPr>
           <w:p>
             <w:r>
-              <w:t>central_10</w:t>
+              <w:t>+0.08</w:t>
             </w:r>
           </w:p>
         </w:tc>
@@ -3093,7 +3847,7 @@
           </w:tcPr>
           <w:p>
             <w:r>
-              <w:t>0.009</w:t>
+              <w:t>[-0.42; +0.68]</w:t>
             </w:r>
           </w:p>
         </w:tc>
@@ -3103,7 +3857,7 @@
           </w:tcPr>
           <w:p>
             <w:r>
-              <w:t>0.382</w:t>
+              <w:t>+0.76</w:t>
             </w:r>
           </w:p>
         </w:tc>
@@ -3113,7 +3867,7 @@
           </w:tcPr>
           <w:p>
             <w:r>
-              <w:t>0.703</w:t>
+              <w:t>+0.83</w:t>
             </w:r>
           </w:p>
         </w:tc>
@@ -3135,7 +3889,7 @@
           </w:tcPr>
           <w:p>
             <w:r>
-              <w:t>central_10</w:t>
+              <w:t>central_10 vs benchmark</w:t>
             </w:r>
           </w:p>
         </w:tc>
@@ -3145,7 +3899,7 @@
           </w:tcPr>
           <w:p>
             <w:r>
-              <w:t>benchmark</w:t>
+              <w:t>-0.81</w:t>
             </w:r>
           </w:p>
         </w:tc>
@@ -3155,7 +3909,7 @@
           </w:tcPr>
           <w:p>
             <w:r>
-              <w:t>-0.062</w:t>
+              <w:t>[-1.62; -0.20]</w:t>
             </w:r>
           </w:p>
         </w:tc>
@@ -3165,7 +3919,7 @@
           </w:tcPr>
           <w:p>
             <w:r>
-              <w:t>-1.958</w:t>
+              <w:t>+0.01</w:t>
             </w:r>
           </w:p>
         </w:tc>
@@ -3175,7 +3929,7 @@
           </w:tcPr>
           <w:p>
             <w:r>
-              <w:t>0.050</w:t>
+              <w:t>+0.11</w:t>
             </w:r>
           </w:p>
         </w:tc>
@@ -3197,7 +3951,7 @@
           </w:tcPr>
           <w:p>
             <w:r>
-              <w:t>peripheral_10</w:t>
+              <w:t>peripheral_10 vs benchmark</w:t>
             </w:r>
           </w:p>
         </w:tc>
@@ -3207,7 +3961,7 @@
           </w:tcPr>
           <w:p>
             <w:r>
-              <w:t>benchmark</w:t>
+              <w:t>-0.43</w:t>
             </w:r>
           </w:p>
         </w:tc>
@@ -3217,7 +3971,7 @@
           </w:tcPr>
           <w:p>
             <w:r>
-              <w:t>-0.043</w:t>
+              <w:t>[-0.99; +0.16]</w:t>
             </w:r>
           </w:p>
         </w:tc>
@@ -3227,7 +3981,7 @@
           </w:tcPr>
           <w:p>
             <w:r>
-              <w:t>-1.073</w:t>
+              <w:t>+0.15</w:t>
             </w:r>
           </w:p>
         </w:tc>
@@ -3237,7 +3991,7 @@
           </w:tcPr>
           <w:p>
             <w:r>
-              <w:t>0.283</w:t>
+              <w:t>+0.50</w:t>
             </w:r>
           </w:p>
         </w:tc>
@@ -3259,7 +4013,7 @@
           </w:tcPr>
           <w:p>
             <w:r>
-              <w:t>hybrid_10</w:t>
+              <w:t>hybrid_10 vs benchmark</w:t>
             </w:r>
           </w:p>
         </w:tc>
@@ -3269,7 +4023,7 @@
           </w:tcPr>
           <w:p>
             <w:r>
-              <w:t>benchmark</w:t>
+              <w:t>-0.74</w:t>
             </w:r>
           </w:p>
         </w:tc>
@@ -3279,7 +4033,7 @@
           </w:tcPr>
           <w:p>
             <w:r>
-              <w:t>-0.054</w:t>
+              <w:t>[-1.41; -0.17]</w:t>
             </w:r>
           </w:p>
         </w:tc>
@@ -3289,7 +4043,7 @@
           </w:tcPr>
           <w:p>
             <w:r>
-              <w:t>-1.589</w:t>
+              <w:t>+0.01</w:t>
             </w:r>
           </w:p>
         </w:tc>
@@ -3299,7 +4053,7 @@
           </w:tcPr>
           <w:p>
             <w:r>
-              <w:t>0.112</w:t>
+              <w:t>+0.17</w:t>
             </w:r>
           </w:p>
         </w:tc>
@@ -3310,6 +4064,503 @@
           <w:p>
             <w:r>
               <w:t>550</w:t>
+            </w:r>
+          </w:p>
+        </w:tc>
+      </w:tr>
+    </w:tbl>
+    <w:p/>
+    <w:p>
+      <w:pPr>
+        <w:pStyle w:val="Heading2"/>
+      </w:pPr>
+      <w:r>
+        <w:rPr>
+          <w:color w:val="1F3B73"/>
+        </w:rPr>
+        <w:t>Robustez por sub-período</w:t>
+      </w:r>
+    </w:p>
+    <w:p>
+      <w:pPr>
+        <w:jc w:val="both"/>
+      </w:pPr>
+      <w:r>
+        <w:t>Como o período fora da amostra cobre uma única janela (2023–2025), a série foi partida em dois sub-períodos consecutivos de tamanho igual e a hipótese de Pozzi foi reavaliada em cada um (Tabela 6). O resultado é honesto e importante: a superioridade da periferia se concentra no primeiro sub-período, de mercado mais fraco, e se inverte no segundo, de recuperação. Em outras palavras, “investir na periferia” comporta-se como uma estratégia defensiva — protege mais nas quedas do que ganha nas altas —, e a vantagem observada na janela completa é dependente de regime, não um efeito estável em todo o ciclo.</w:t>
+      </w:r>
+    </w:p>
+    <w:p>
+      <w:r>
+        <w:rPr>
+          <w:b/>
+          <w:color w:val="1F3B73"/>
+        </w:rPr>
+        <w:t>Tabela 6 — Índice de Sharpe líquido por sub-período (centro × periferia × benchmark)</w:t>
+      </w:r>
+    </w:p>
+    <w:tbl>
+      <w:tblPr>
+        <w:tblStyle w:val="LightGrid-Accent1"/>
+        <w:tblW w:type="auto" w:w="0"/>
+        <w:tblLook w:firstColumn="1" w:firstRow="1" w:lastColumn="0" w:lastRow="0" w:noHBand="0" w:noVBand="1" w:val="04A0"/>
+      </w:tblPr>
+      <w:tblGrid>
+        <w:gridCol w:w="785"/>
+        <w:gridCol w:w="785"/>
+        <w:gridCol w:w="785"/>
+        <w:gridCol w:w="785"/>
+        <w:gridCol w:w="785"/>
+        <w:gridCol w:w="785"/>
+        <w:gridCol w:w="785"/>
+        <w:gridCol w:w="785"/>
+        <w:gridCol w:w="785"/>
+        <w:gridCol w:w="785"/>
+        <w:gridCol w:w="785"/>
+      </w:tblGrid>
+      <w:tr>
+        <w:tc>
+          <w:tcPr>
+            <w:tcW w:type="dxa" w:w="785"/>
+          </w:tcPr>
+          <w:p>
+            <w:r>
+              <w:t>periodo</w:t>
+            </w:r>
+          </w:p>
+        </w:tc>
+        <w:tc>
+          <w:tcPr>
+            <w:tcW w:type="dxa" w:w="785"/>
+          </w:tcPr>
+          <w:p>
+            <w:r>
+              <w:t>inicio</w:t>
+            </w:r>
+          </w:p>
+        </w:tc>
+        <w:tc>
+          <w:tcPr>
+            <w:tcW w:type="dxa" w:w="785"/>
+          </w:tcPr>
+          <w:p>
+            <w:r>
+              <w:t>fim</w:t>
+            </w:r>
+          </w:p>
+        </w:tc>
+        <w:tc>
+          <w:tcPr>
+            <w:tcW w:type="dxa" w:w="785"/>
+          </w:tcPr>
+          <w:p>
+            <w:r>
+              <w:t>n</w:t>
+            </w:r>
+          </w:p>
+        </w:tc>
+        <w:tc>
+          <w:tcPr>
+            <w:tcW w:type="dxa" w:w="785"/>
+          </w:tcPr>
+          <w:p>
+            <w:r>
+              <w:t>sharpe_central_10</w:t>
+            </w:r>
+          </w:p>
+        </w:tc>
+        <w:tc>
+          <w:tcPr>
+            <w:tcW w:type="dxa" w:w="785"/>
+          </w:tcPr>
+          <w:p>
+            <w:r>
+              <w:t>sharpe_perif_10</w:t>
+            </w:r>
+          </w:p>
+        </w:tc>
+        <w:tc>
+          <w:tcPr>
+            <w:tcW w:type="dxa" w:w="785"/>
+          </w:tcPr>
+          <w:p>
+            <w:r>
+              <w:t>sharpe_central_15</w:t>
+            </w:r>
+          </w:p>
+        </w:tc>
+        <w:tc>
+          <w:tcPr>
+            <w:tcW w:type="dxa" w:w="785"/>
+          </w:tcPr>
+          <w:p>
+            <w:r>
+              <w:t>sharpe_perif_15</w:t>
+            </w:r>
+          </w:p>
+        </w:tc>
+        <w:tc>
+          <w:tcPr>
+            <w:tcW w:type="dxa" w:w="785"/>
+          </w:tcPr>
+          <w:p>
+            <w:r>
+              <w:t>sharpe_central_20</w:t>
+            </w:r>
+          </w:p>
+        </w:tc>
+        <w:tc>
+          <w:tcPr>
+            <w:tcW w:type="dxa" w:w="785"/>
+          </w:tcPr>
+          <w:p>
+            <w:r>
+              <w:t>sharpe_perif_20</w:t>
+            </w:r>
+          </w:p>
+        </w:tc>
+        <w:tc>
+          <w:tcPr>
+            <w:tcW w:type="dxa" w:w="785"/>
+          </w:tcPr>
+          <w:p>
+            <w:r>
+              <w:t>sharpe_benchmark</w:t>
+            </w:r>
+          </w:p>
+        </w:tc>
+      </w:tr>
+      <w:tr>
+        <w:tc>
+          <w:tcPr>
+            <w:tcW w:type="dxa" w:w="785"/>
+          </w:tcPr>
+          <w:p>
+            <w:r>
+              <w:t>completo</w:t>
+            </w:r>
+          </w:p>
+        </w:tc>
+        <w:tc>
+          <w:tcPr>
+            <w:tcW w:type="dxa" w:w="785"/>
+          </w:tcPr>
+          <w:p>
+            <w:r>
+              <w:t>2023-08-09</w:t>
+            </w:r>
+          </w:p>
+        </w:tc>
+        <w:tc>
+          <w:tcPr>
+            <w:tcW w:type="dxa" w:w="785"/>
+          </w:tcPr>
+          <w:p>
+            <w:r>
+              <w:t>2025-10-20</w:t>
+            </w:r>
+          </w:p>
+        </w:tc>
+        <w:tc>
+          <w:tcPr>
+            <w:tcW w:type="dxa" w:w="785"/>
+          </w:tcPr>
+          <w:p>
+            <w:r>
+              <w:t>550</w:t>
+            </w:r>
+          </w:p>
+        </w:tc>
+        <w:tc>
+          <w:tcPr>
+            <w:tcW w:type="dxa" w:w="785"/>
+          </w:tcPr>
+          <w:p>
+            <w:r>
+              <w:t>-1.72</w:t>
+            </w:r>
+          </w:p>
+        </w:tc>
+        <w:tc>
+          <w:tcPr>
+            <w:tcW w:type="dxa" w:w="785"/>
+          </w:tcPr>
+          <w:p>
+            <w:r>
+              <w:t>-1.34</w:t>
+            </w:r>
+          </w:p>
+        </w:tc>
+        <w:tc>
+          <w:tcPr>
+            <w:tcW w:type="dxa" w:w="785"/>
+          </w:tcPr>
+          <w:p>
+            <w:r>
+              <w:t>-1.63</w:t>
+            </w:r>
+          </w:p>
+        </w:tc>
+        <w:tc>
+          <w:tcPr>
+            <w:tcW w:type="dxa" w:w="785"/>
+          </w:tcPr>
+          <w:p>
+            <w:r>
+              <w:t>-1.42</w:t>
+            </w:r>
+          </w:p>
+        </w:tc>
+        <w:tc>
+          <w:tcPr>
+            <w:tcW w:type="dxa" w:w="785"/>
+          </w:tcPr>
+          <w:p>
+            <w:r>
+              <w:t>-1.62</w:t>
+            </w:r>
+          </w:p>
+        </w:tc>
+        <w:tc>
+          <w:tcPr>
+            <w:tcW w:type="dxa" w:w="785"/>
+          </w:tcPr>
+          <w:p>
+            <w:r>
+              <w:t>-1.40</w:t>
+            </w:r>
+          </w:p>
+        </w:tc>
+        <w:tc>
+          <w:tcPr>
+            <w:tcW w:type="dxa" w:w="785"/>
+          </w:tcPr>
+          <w:p>
+            <w:r>
+              <w:t>-0.91</w:t>
+            </w:r>
+          </w:p>
+        </w:tc>
+      </w:tr>
+      <w:tr>
+        <w:tc>
+          <w:tcPr>
+            <w:tcW w:type="dxa" w:w="785"/>
+          </w:tcPr>
+          <w:p>
+            <w:r>
+              <w:t>sub1</w:t>
+            </w:r>
+          </w:p>
+        </w:tc>
+        <w:tc>
+          <w:tcPr>
+            <w:tcW w:type="dxa" w:w="785"/>
+          </w:tcPr>
+          <w:p>
+            <w:r>
+              <w:t>2023-08-09</w:t>
+            </w:r>
+          </w:p>
+        </w:tc>
+        <w:tc>
+          <w:tcPr>
+            <w:tcW w:type="dxa" w:w="785"/>
+          </w:tcPr>
+          <w:p>
+            <w:r>
+              <w:t>2024-09-12</w:t>
+            </w:r>
+          </w:p>
+        </w:tc>
+        <w:tc>
+          <w:tcPr>
+            <w:tcW w:type="dxa" w:w="785"/>
+          </w:tcPr>
+          <w:p>
+            <w:r>
+              <w:t>275</w:t>
+            </w:r>
+          </w:p>
+        </w:tc>
+        <w:tc>
+          <w:tcPr>
+            <w:tcW w:type="dxa" w:w="785"/>
+          </w:tcPr>
+          <w:p>
+            <w:r>
+              <w:t>-2.62</w:t>
+            </w:r>
+          </w:p>
+        </w:tc>
+        <w:tc>
+          <w:tcPr>
+            <w:tcW w:type="dxa" w:w="785"/>
+          </w:tcPr>
+          <w:p>
+            <w:r>
+              <w:t>-1.52</w:t>
+            </w:r>
+          </w:p>
+        </w:tc>
+        <w:tc>
+          <w:tcPr>
+            <w:tcW w:type="dxa" w:w="785"/>
+          </w:tcPr>
+          <w:p>
+            <w:r>
+              <w:t>-2.64</w:t>
+            </w:r>
+          </w:p>
+        </w:tc>
+        <w:tc>
+          <w:tcPr>
+            <w:tcW w:type="dxa" w:w="785"/>
+          </w:tcPr>
+          <w:p>
+            <w:r>
+              <w:t>-1.70</w:t>
+            </w:r>
+          </w:p>
+        </w:tc>
+        <w:tc>
+          <w:tcPr>
+            <w:tcW w:type="dxa" w:w="785"/>
+          </w:tcPr>
+          <w:p>
+            <w:r>
+              <w:t>-2.62</w:t>
+            </w:r>
+          </w:p>
+        </w:tc>
+        <w:tc>
+          <w:tcPr>
+            <w:tcW w:type="dxa" w:w="785"/>
+          </w:tcPr>
+          <w:p>
+            <w:r>
+              <w:t>-1.59</w:t>
+            </w:r>
+          </w:p>
+        </w:tc>
+        <w:tc>
+          <w:tcPr>
+            <w:tcW w:type="dxa" w:w="785"/>
+          </w:tcPr>
+          <w:p>
+            <w:r>
+              <w:t>-1.16</w:t>
+            </w:r>
+          </w:p>
+        </w:tc>
+      </w:tr>
+      <w:tr>
+        <w:tc>
+          <w:tcPr>
+            <w:tcW w:type="dxa" w:w="785"/>
+          </w:tcPr>
+          <w:p>
+            <w:r>
+              <w:t>sub2</w:t>
+            </w:r>
+          </w:p>
+        </w:tc>
+        <w:tc>
+          <w:tcPr>
+            <w:tcW w:type="dxa" w:w="785"/>
+          </w:tcPr>
+          <w:p>
+            <w:r>
+              <w:t>2024-09-13</w:t>
+            </w:r>
+          </w:p>
+        </w:tc>
+        <w:tc>
+          <w:tcPr>
+            <w:tcW w:type="dxa" w:w="785"/>
+          </w:tcPr>
+          <w:p>
+            <w:r>
+              <w:t>2025-10-20</w:t>
+            </w:r>
+          </w:p>
+        </w:tc>
+        <w:tc>
+          <w:tcPr>
+            <w:tcW w:type="dxa" w:w="785"/>
+          </w:tcPr>
+          <w:p>
+            <w:r>
+              <w:t>275</w:t>
+            </w:r>
+          </w:p>
+        </w:tc>
+        <w:tc>
+          <w:tcPr>
+            <w:tcW w:type="dxa" w:w="785"/>
+          </w:tcPr>
+          <w:p>
+            <w:r>
+              <w:t>-1.25</w:t>
+            </w:r>
+          </w:p>
+        </w:tc>
+        <w:tc>
+          <w:tcPr>
+            <w:tcW w:type="dxa" w:w="785"/>
+          </w:tcPr>
+          <w:p>
+            <w:r>
+              <w:t>-1.36</w:t>
+            </w:r>
+          </w:p>
+        </w:tc>
+        <w:tc>
+          <w:tcPr>
+            <w:tcW w:type="dxa" w:w="785"/>
+          </w:tcPr>
+          <w:p>
+            <w:r>
+              <w:t>-1.10</w:t>
+            </w:r>
+          </w:p>
+        </w:tc>
+        <w:tc>
+          <w:tcPr>
+            <w:tcW w:type="dxa" w:w="785"/>
+          </w:tcPr>
+          <w:p>
+            <w:r>
+              <w:t>-1.37</w:t>
+            </w:r>
+          </w:p>
+        </w:tc>
+        <w:tc>
+          <w:tcPr>
+            <w:tcW w:type="dxa" w:w="785"/>
+          </w:tcPr>
+          <w:p>
+            <w:r>
+              <w:t>-1.17</w:t>
+            </w:r>
+          </w:p>
+        </w:tc>
+        <w:tc>
+          <w:tcPr>
+            <w:tcW w:type="dxa" w:w="785"/>
+          </w:tcPr>
+          <w:p>
+            <w:r>
+              <w:t>-1.40</w:t>
+            </w:r>
+          </w:p>
+        </w:tc>
+        <w:tc>
+          <w:tcPr>
+            <w:tcW w:type="dxa" w:w="785"/>
+          </w:tcPr>
+          <w:p>
+            <w:r>
+              <w:t>-0.76</w:t>
             </w:r>
           </w:p>
         </w:tc>
@@ -3332,7 +4583,7 @@
         <w:jc w:val="both"/>
       </w:pPr>
       <w:r>
-        <w:t>Aplicando o mesmo arcabouço à AGM (árvore com N−1 arestas) sobre exatamente o mesmo universo e janela, obtém-se a Tabela 5. O GPMF supera a AGM nas três carteiras. Estes números são uma referência interna; a comparação oficial do trabalho conjunto deve usar os resultados do braço AGM do parceiro (ver Seção “Comparação com o braço AGM”).</w:t>
+        <w:t>Aplicando o mesmo arcabouço à AGM (árvore com N−1 arestas) sobre exatamente o mesmo universo e janela, obtém-se a Tabela 7. O GPMF supera a AGM nas três carteiras. Estes números são uma referência interna; a comparação oficial do trabalho conjunto deve usar os resultados do braço AGM do parceiro (ver Seção “Comparação com o braço AGM”).</w:t>
       </w:r>
     </w:p>
     <w:p>
@@ -3341,7 +4592,7 @@
           <w:b/>
           <w:color w:val="1F3B73"/>
         </w:rPr>
-        <w:t>Tabela 5 — GPMF × AGM × benchmark (carteiras de tamanho 10, líquido)</w:t>
+        <w:t>Tabela 7 — GPMF × AGM × benchmark (carteiras de tamanho 10, líquido)</w:t>
       </w:r>
     </w:p>
     <w:tbl>
@@ -3436,7 +4687,7 @@
           </w:tcPr>
           <w:p>
             <w:r>
-              <w:t>-0.300</w:t>
+              <w:t>-1.720</w:t>
             </w:r>
           </w:p>
         </w:tc>
@@ -3488,7 +4739,7 @@
           </w:tcPr>
           <w:p>
             <w:r>
-              <w:t>0.007</w:t>
+              <w:t>-1.340</w:t>
             </w:r>
           </w:p>
         </w:tc>
@@ -3540,7 +4791,7 @@
           </w:tcPr>
           <w:p>
             <w:r>
-              <w:t>-0.165</w:t>
+              <w:t>-1.642</w:t>
             </w:r>
           </w:p>
         </w:tc>
@@ -3592,7 +4843,7 @@
           </w:tcPr>
           <w:p>
             <w:r>
-              <w:t>-0.039</w:t>
+              <w:t>-1.448</w:t>
             </w:r>
           </w:p>
         </w:tc>
@@ -3644,7 +4895,7 @@
           </w:tcPr>
           <w:p>
             <w:r>
-              <w:t>-0.208</w:t>
+              <w:t>-1.593</w:t>
             </w:r>
           </w:p>
         </w:tc>
@@ -3696,7 +4947,7 @@
           </w:tcPr>
           <w:p>
             <w:r>
-              <w:t>-0.396</w:t>
+              <w:t>-1.853</w:t>
             </w:r>
           </w:p>
         </w:tc>
@@ -3748,7 +4999,7 @@
           </w:tcPr>
           <w:p>
             <w:r>
-              <w:t>0.690</w:t>
+              <w:t>-0.907</w:t>
             </w:r>
           </w:p>
         </w:tc>
@@ -3842,7 +5093,7 @@
         <w:jc w:val="both"/>
       </w:pPr>
       <w:r>
-        <w:t>O relatório parcial encontrou, na avaliação estática, vantagem das carteiras centrais — resultado aparentemente contrário a Pozzi et al. (2013). Com a convenção de dividendos corrigida e o universo determinístico, essa vantagem desaparece: já dentro da amostra as carteiras periféricas apresentam melhor Índice de Sharpe, e, mais importante, fora da amostra elas superam as centrais em todos os tamanhos testados, com o GPMF reconstruído a cada mês. A evidência, portanto, passa a favorecer a hipótese da periferia para os FIIs. O GPMF também supera a AGM sob metodologia idêntica, coerente com a maior quantidade de estrutura preservada pelo grafo planar.</w:t>
+        <w:t>O relatório parcial encontrou, na avaliação estática, vantagem das carteiras centrais — resultado aparentemente contrário a Pozzi et al. (2013). Com a convenção de dividendos corrigida, o universo determinístico e o Índice de Sharpe medido sobre o excesso ao CDI, essa vantagem desaparece: na janela completa fora da amostra as carteiras periféricas superam as centrais em todos os tamanhos testados, com o GPMF reconstruído a cada mês. A evidência, portanto, passa a favorecer qualitativamente a hipótese da periferia para os FIIs, e o GPMF supera a AGM sob metodologia idêntica, coerente com a maior quantidade de estrutura preservada pelo grafo planar. Cabe notar que, ao se descontar o CDI (em média elevado no período), todos os Índices de Sharpe — inclusive o do benchmark — tornam-se negativos; a leitura relevante é comparativa, não o sinal.</w:t>
       </w:r>
     </w:p>
     <w:p>
@@ -3850,7 +5101,7 @@
         <w:jc w:val="both"/>
       </w:pPr>
       <w:r>
-        <w:t>Há, contudo, duas ressalvas importantes. Primeira: líquido de custos de transação e imposto, o benchmark passivo (IFIX) supera todas as carteiras ativas — o giro mensal das estratégias periféricas e híbridas, de maior rotatividade, corrói o ganho bruto; a carteira Central-10 chega a ficar significativamente abaixo do benchmark (p ≈ 0,05). Segunda: entre as próprias carteiras GPMF, as diferenças de Índice de Sharpe não atingem significância estatística a 5%. Assim, embora a evidência fora da amostra seja qualitativamente favorável à periferia e ao GPMF, a vantagem não sobrevive aos custos nem alcança significância — o que reforça a importância de janelas mais longas e de regras de seleção que controlem o giro em trabalhos futuros.</w:t>
+        <w:t>Há, contudo, três ressalvas que delimitam o alcance da conclusão. Primeira: líquido de custos de transação e imposto, nenhuma carteira ativa supera o benchmark passivo (IFIX); há indício (pelo bootstrap, mas não confirmado pelo teste mais conservador de Jobson-Korkie) de que a Central-10 e a Híbrida-10 fiquem atrás do índice, enquanto a Periférica-10 apenas o empata — ou seja, a periferia, no melhor cenário, iguala a gestão passiva. Segunda: entre as próprias carteiras GPMF, a diferença periferia−centro não atinge significância estatística (o intervalo de confiança por bootstrap cruza zero). Terceira, e mais importante para a interpretação: a superioridade da periferia não é estável no tempo — concentra-se no sub-período de mercado fraco e inverte-se na recuperação, comportando-se como uma estratégia defensiva, dependente de regime. Em síntese, a evidência fora da amostra é qualitativamente favorável à periferia e ao GPMF, mas a vantagem não sobrevive aos custos, não alcança significância e não é robusta ao longo do ciclo — o que reforça a importância de janelas mais longas, de regras de seleção que controlem o giro e de testes em múltiplos regimes de mercado em trabalhos futuros.</w:t>
       </w:r>
     </w:p>
     <w:p>

</xml_diff>